<commit_message>
Finalisaing documents. ms.docx ready and refs are all checked, highlights and oustanding questions updated. Last thing to do is response to Reviewers to add line numbers and bit of intro, then submit.
</commit_message>
<xml_diff>
--- a/docs/Revision1/Highlights.docx
+++ b/docs/Revision1/Highlights.docx
@@ -78,7 +78,25 @@
           <w:lang w:val="en-US"/>
           <w14:ligatures w14:val="none"/>
         </w:rPr>
-        <w:t xml:space="preserve"> and interactions between species that drive population and community scale responses has been limited.</w:t>
+        <w:t xml:space="preserve"> and interactions </w:t>
+      </w:r>
+      <w:r>
+        <w:rPr>
+          <w:rFonts w:ascii="Times New Roman" w:eastAsia="Cambria" w:hAnsi="Times New Roman" w:cs="Times New Roman"/>
+          <w:kern w:val="0"/>
+          <w:lang w:val="en-US"/>
+          <w14:ligatures w14:val="none"/>
+        </w:rPr>
+        <w:t>among</w:t>
+      </w:r>
+      <w:r>
+        <w:rPr>
+          <w:rFonts w:ascii="Times New Roman" w:eastAsia="Cambria" w:hAnsi="Times New Roman" w:cs="Times New Roman"/>
+          <w:kern w:val="0"/>
+          <w:lang w:val="en-US"/>
+          <w14:ligatures w14:val="none"/>
+        </w:rPr>
+        <w:t xml:space="preserve"> species that drive population and community scale responses has been limited.</w:t>
       </w:r>
     </w:p>
     <w:p>
@@ -180,7 +198,7 @@
           <w:lang w:val="en-US"/>
           <w14:ligatures w14:val="none"/>
         </w:rPr>
-        <w:t xml:space="preserve">We illustrate how the opportunities provided by a systems-modelling approach will rapidly advance our understanding of the impacts of extreme heat and thus </w:t>
+        <w:t xml:space="preserve">We illustrate how the opportunities provided by a systems-modelling approach will rapidly advance our understanding of the impacts of extreme heat and </w:t>
       </w:r>
       <w:proofErr w:type="spellStart"/>
       <w:r>
@@ -200,7 +218,25 @@
           <w:lang w:val="en-US"/>
           <w14:ligatures w14:val="none"/>
         </w:rPr>
-        <w:t xml:space="preserve"> new potential to mitigate these impacts.</w:t>
+        <w:t xml:space="preserve"> new potential </w:t>
+      </w:r>
+      <w:r>
+        <w:rPr>
+          <w:rFonts w:ascii="Times New Roman" w:eastAsia="Cambria" w:hAnsi="Times New Roman" w:cs="Times New Roman"/>
+          <w:kern w:val="0"/>
+          <w:lang w:val="en-US"/>
+          <w14:ligatures w14:val="none"/>
+        </w:rPr>
+        <w:t xml:space="preserve">solutions </w:t>
+      </w:r>
+      <w:r>
+        <w:rPr>
+          <w:rFonts w:ascii="Times New Roman" w:eastAsia="Cambria" w:hAnsi="Times New Roman" w:cs="Times New Roman"/>
+          <w:kern w:val="0"/>
+          <w:lang w:val="en-US"/>
+          <w14:ligatures w14:val="none"/>
+        </w:rPr>
+        <w:t>to mitigate impacts.</w:t>
       </w:r>
     </w:p>
     <w:sectPr>

</xml_diff>